<commit_message>
Back-to-top, warmer hero, punchier copy (#3)
Blend the sleek old design back into the Plum system: subtle shadows
on feature cards, warmer hero art, wider editorial column, floating
back-to-top pill. Copy pass across the guide with real study links
(Dunbar, Sophie Leroy, Cal Newport, bus factor, Zeigarnik, Parkinson,
Hawthorne), pop-culture nods (Succession, Silicon Valley, Panchayat),
and sharper editor's notes. Toolkit .docx regenerated.
</commit_message>
<xml_diff>
--- a/public/plum-internal-comms-toolkit.docx
+++ b/public/plum-internal-comms-toolkit.docx
@@ -90,7 +90,7 @@
           <w:sz w:val="22"/>
           <w:szCs w:val="22"/>
         </w:rPr>
-        <w:t xml:space="preserve">Internal comms in most Indian startups is not designed. It is inherited from whoever set up Slack first, and it hardens into culture from there. The channel structure, the meeting cadence, the response-time expectations were not chosen on purpose. All of it still shapes how the company runs.</w:t>
+        <w:t xml:space="preserve">Every Indian startup has an internal comms system. Almost none of them chose it. The channels, the meeting cadence, the response-time norms were inherited from whoever set up Slack first, and they hardened into culture. It is the equivalent of moving into a house and never rearranging the furniture. You live around the shape of what someone else decided.</w:t>
       </w:r>
     </w:p>
     <w:p>
@@ -103,7 +103,7 @@
           <w:sz w:val="22"/>
           <w:szCs w:val="22"/>
         </w:rPr>
-        <w:t xml:space="preserve">The cost of getting this wrong is not always visible from the founder's chair. Employees miss things they should have seen. Decisions get made in DMs and never surface. The founder ends up as the human router, forwarding messages between teams that should be talking to each other directly. By the time it starts to hurt, it has been that way for a year.</w:t>
+        <w:t xml:space="preserve">The bill for this shows up late. Employees miss things they should have seen. Decisions get made in DMs and evaporate before the record forms. The founder becomes the human router, forwarding messages between teams that could just be talking. By the time it hurts, it has been that way for a year, and unlearning it feels harder than it should.</w:t>
       </w:r>
     </w:p>
     <w:p>
@@ -116,7 +116,7 @@
           <w:sz w:val="22"/>
           <w:szCs w:val="22"/>
         </w:rPr>
-        <w:t xml:space="preserve">This guide is an opinionated attempt to help founders design their internal comms on purpose. It is staged by team size and backed with sourced numbers where they help. Use it as a working reference: pick your team size, start with the sections you have not yet thought about, and copy the templates at the end of each one.</w:t>
+        <w:t xml:space="preserve">This guide is a chance to design it on purpose. It is staged by team size, sourced where sources help, and full of things you can copy today. Pick your headcount, open the sections you have been avoiding, and steal the templates at the bottom. If any of it makes you say &lt;em&gt;we already do the opposite of this&lt;/em&gt;, that is the point.</w:t>
       </w:r>
     </w:p>
     <w:p>
@@ -195,7 +195,7 @@
           <w:sz w:val="22"/>
           <w:szCs w:val="22"/>
         </w:rPr>
-        <w:t xml:space="preserve">The all-hands is the loudest signal a company sends about how it makes decisions and who gets to hear about them. Gallup's 2026 report put Indian employee engagement at 23%, a four-year low, and manager engagement in India fell from 39% to 30% in a single year. When managers pass along less of the strategy sideways, the all-hands has to carry more of it directly. The founder who treats it as a status update is missing the room's real question: is this still a place I want to work in a year.</w:t>
+        <w:t xml:space="preserve">The all-hands is the loudest signal a company sends about how it makes decisions and who gets to hear about them. Gallup's 2026 report put Indian employee engagement at 23%, a four-year low, and manager engagement in India fell from 39% to 30% in a single year. When managers pass along less of the strategy sideways, the all-hands has to carry more of it directly. And there is a hard ceiling on how many people can meaningfully talk to each other at once: &lt;a href="https://en.wikipedia.org/wiki/Dunbar%27s_number" target="_blank" rel="noopener"&gt;Dunbar's number&lt;/a&gt; says the number of stable relationships one person can maintain caps out around 150, and the working-conversation subset is much smaller. The founder who treats the all-hands as a status update is missing the room's real question: is this still a place I want to work in a year.</w:t>
       </w:r>
     </w:p>
     <w:p>
@@ -856,7 +856,7 @@
           <w:sz w:val="22"/>
           <w:szCs w:val="22"/>
         </w:rPr>
-        <w:t xml:space="preserve">Cadence is the least important decision here. What matters is whether people leave with real answers to real questions.</w:t>
+        <w:t xml:space="preserve">The &lt;em&gt;Succession&lt;/em&gt; test: if this were dramatised, would anyone find the plot interesting? If your all-hands is 30 minutes of good news read from a slide, the answer is no, and your team is quietly checking their phones.</w:t>
       </w:r>
     </w:p>
     <w:p>
@@ -905,7 +905,7 @@
           <w:sz w:val="22"/>
           <w:szCs w:val="22"/>
         </w:rPr>
-        <w:t xml:space="preserve">Most Indian startups do not have one, and the ones that do run it out of HR. It reads like HR. A newsletter is the only piece of the stack that becomes a permanent record of what the company was thinking at each phase. Ten years in, the archive is the truest history of the company. The founder who sends it in their own voice, in the first year, will be grateful in year three that they did.</w:t>
+        <w:t xml:space="preserve">Most Indian startups do not have one, and the ones that do run it out of HR. It reads like HR. A newsletter is the only piece of the stack that becomes a permanent record of what the company was thinking at each phase. Matt Levine's &lt;em&gt;Money Stuff&lt;/em&gt; and Julian Shapiro's writing are forwarded around not because they are important but because they are written like a person. Ten years in, your archive will be the truest history of the company. The founder who sends it in their own voice, in the first year, will be grateful in year three that they did.</w:t>
       </w:r>
     </w:p>
     <w:p>
@@ -1614,7 +1614,7 @@
           <w:sz w:val="22"/>
           <w:szCs w:val="22"/>
         </w:rPr>
-        <w:t xml:space="preserve">The best newsletter I have read from an Indian company was 350 words long and always came in on a Friday. It got forwarded around like gossip.</w:t>
+        <w:t xml:space="preserve">The best newsletter I have read from an Indian company was 350 words long and always came in on a Friday. It got forwarded around like gossip. That is the only KPI that matters.</w:t>
       </w:r>
     </w:p>
     <w:p>
@@ -1663,7 +1663,7 @@
           <w:sz w:val="22"/>
           <w:szCs w:val="22"/>
         </w:rPr>
-        <w:t xml:space="preserve">The async update replaces the standing status meeting. Done well, it saves a full afternoon a week per team and gives leadership a written record of what is happening without pulling anyone into a room. Microsoft's 2025 Work Trend Index, based on Microsoft 365 telemetry across 31 markets including India, found employees are interrupted every two minutes during core work hours. The async update is the format that fights back. The company that does it well ends up with a searchable history of every team's week; the one that does it badly ends up with a graveyard of unread Notion pages.</w:t>
+        <w:t xml:space="preserve">The async update replaces the standing status meeting. Done well, it saves a full afternoon a week per team and gives leadership a written record of what is happening without pulling anyone into a room. Microsoft's 2025 Work Trend Index, based on Microsoft 365 telemetry across 31 markets including India, found employees are interrupted every two minutes during core work hours. Sophie Leroy's &lt;a href="https://www.sciencedirect.com/science/article/abs/pii/S0749597809000399" target="_blank" rel="noopener"&gt;attention-residue research&lt;/a&gt; shows that every context switch leaves a cognitive smear on what comes next. The async update is the format that fights both. The company that does it well ends up with a searchable history of every team's week. The one that does it badly ends up with a graveyard of unread Notion pages.</w:t>
       </w:r>
     </w:p>
     <w:p>
@@ -2351,7 +2351,7 @@
           <w:sz w:val="22"/>
           <w:szCs w:val="22"/>
         </w:rPr>
-        <w:t xml:space="preserve">The Slack setup is the most consequential design decision a company makes about comms, and the one leadership least often owns. It defaults into whatever the first three engineers set up. Most Indian companies actually run on a mix: Slack for tech teams, Google Chat inside Workspace, Teams at the enterprise end, and WhatsApp for everything else. The tool matters less than the discipline. The workspace that is designed on purpose in month six is the one that still scales at month sixty; the one that is not, is not.</w:t>
+        <w:t xml:space="preserve">The Slack setup is the most consequential design decision a company makes about comms, and the one leadership least often owns. It defaults into whatever the first three engineers set up. Most Indian companies actually run on a mix: Slack for tech teams, Google Chat inside Workspace, Teams at the enterprise end, and WhatsApp for everything else. The tool matters less than the discipline. Cal Newport calls the alternative the &lt;a href="https://calnewport.com/a-world-without-email/" target="_blank" rel="noopener"&gt;hyperactive hive mind&lt;/a&gt;, and every unstructured Slack becomes one within eighteen months. The workspace that is designed on purpose in month six is the one that still scales at month sixty. The one that is not, is not.</w:t>
       </w:r>
     </w:p>
     <w:p>
@@ -3117,7 +3117,7 @@
           <w:sz w:val="22"/>
           <w:szCs w:val="22"/>
         </w:rPr>
-        <w:t xml:space="preserve">The best Slack setups I have seen delete more channels than they add each quarter. That is the whole discipline.</w:t>
+        <w:t xml:space="preserve">The best Slack setups I have seen delete more channels than they add each quarter. That is the whole discipline. Everything else is decor.</w:t>
       </w:r>
     </w:p>
     <w:p>
@@ -3166,7 +3166,7 @@
           <w:sz w:val="22"/>
           <w:szCs w:val="22"/>
         </w:rPr>
-        <w:t xml:space="preserve">The wiki is the difference between context that compounds and context that leaves when someone quits. Every founder knows they need one. Most underinvest, because the payoff shows up only after the person who wrote it has left. Startups that treat the wiki as the operating system, not the intranet, spend fewer hours a week answering the same questions and lose less institutional memory when someone moves on.</w:t>
+        <w:t xml:space="preserve">The wiki is the difference between context that compounds and context that leaves when someone quits. Every founder knows they need one. Most underinvest, because the payoff shows up only after the person who wrote it has left. Engineers call this the &lt;a href="https://en.wikipedia.org/wiki/Bus_factor" target="_blank" rel="noopener"&gt;bus factor&lt;/a&gt;: the smallest number of people who could go under a bus before the project can no longer continue. A living wiki raises your bus factor for free. Startups that treat the wiki as the operating system, not the intranet, spend fewer hours a week answering the same questions and lose less institutional memory when someone moves on.</w:t>
       </w:r>
     </w:p>
     <w:p>
@@ -3993,7 +3993,7 @@
           <w:sz w:val="22"/>
           <w:szCs w:val="22"/>
         </w:rPr>
-        <w:t xml:space="preserve">How you announce something reveals what you think announcements are for. Big news dropped in the wrong channel gets missed, misheard, or reframed as gossip before leadership can tell the real story. Matching the weight of the news to the medium is the single highest-leverage change in this guide. The company that gets this right builds trust every time it opens its mouth; the one that gets it wrong pays for it in ways that show up in the exit interview.</w:t>
+        <w:t xml:space="preserve">How you announce something reveals what you think announcements are for. Big news dropped in the wrong channel gets missed, misheard, or reframed as gossip before leadership can tell the real story. This is the &lt;a href="https://en.wikipedia.org/wiki/Zeigarnik_effect" target="_blank" rel="noopener"&gt;Zeigarnik effect&lt;/a&gt; working against you: unfinished or half-told stories occupy the mind far longer than closed ones, and your team will fill the gaps you leave open. Matching the weight of the news to the medium is the single highest-leverage change in this guide. The company that gets this right builds trust every time it opens its mouth. The one that gets it wrong pays for it in ways that show up in the exit interview.</w:t>
       </w:r>
     </w:p>
     <w:p>
@@ -4723,7 +4723,7 @@
           <w:sz w:val="22"/>
           <w:szCs w:val="22"/>
         </w:rPr>
-        <w:t xml:space="preserve">If you find yourself explaining the same news three times to three different people, it needed a bigger channel than the one you picked.</w:t>
+        <w:t xml:space="preserve">If you find yourself explaining the same news three times to three different people, it needed a bigger channel than the one you picked. And the third person's version will already be different from what you actually said.</w:t>
       </w:r>
     </w:p>
     <w:p>
@@ -4772,7 +4772,7 @@
           <w:sz w:val="22"/>
           <w:szCs w:val="22"/>
         </w:rPr>
-        <w:t xml:space="preserve">WhatsApp is the shadow comms layer at almost every Indian company. It is the default for founders, field teams, factory floors, and anyone who checks personal phones more than laptops. It is also the layer with zero governance. When an employee leaves, they walk out with every group chat still on their phone, including whatever was said inside them. The company that treats WhatsApp as invisible pays for it during an audit, a dispute, or a data-privacy question years later.</w:t>
+        <w:t xml:space="preserve">WhatsApp is the shadow comms layer at almost every Indian company. It is the default for founders, field teams, factory floors, and anyone who checks personal phones more than laptops. If &lt;em&gt;Panchayat&lt;/em&gt; made one thing obvious, it is that in this country, a WhatsApp group is the operating system for anything that touches real people. It is also the layer with zero governance. When an employee leaves, they walk out with every group chat still on their phone, including whatever was said inside them. The company that treats WhatsApp as invisible pays for it during an audit, a dispute, or a data-privacy question years later.</w:t>
       </w:r>
     </w:p>
     <w:p>
@@ -5535,7 +5535,7 @@
           <w:sz w:val="22"/>
           <w:szCs w:val="22"/>
         </w:rPr>
-        <w:t xml:space="preserve">Meeting norms are the invisible rules of how a company runs its time. Microsoft's telemetry found meetings starting after 8 pm are up 16% year over year (Work Trend Index 2025, 31 markets including India). Most Indian startups have never written meeting norms down. The best ones do, and revisit them every six months. Not writing them down is a decision: it says the loudest people in the room set the rules, and everyone else adapts to that.</w:t>
+        <w:t xml:space="preserve">Meeting norms are the invisible rules of how a company runs its time. Microsoft's telemetry found meetings starting after 8 pm are up 16% year over year (Work Trend Index 2025, 31 markets including India). Left alone, meetings obey &lt;a href="https://en.wikipedia.org/wiki/Parkinson%27s_law" target="_blank" rel="noopener"&gt;Parkinson's Law&lt;/a&gt;: work expands to fill the time available for its completion, and a 60-minute slot always finds 60 minutes of business. Most Indian startups have never written meeting norms down. The best ones do, and revisit them every six months. Not writing them down is a decision: it says the loudest people in the room set the rules, and everyone else adapts to that.</w:t>
       </w:r>
     </w:p>
     <w:p>
@@ -6286,7 +6286,7 @@
           <w:sz w:val="22"/>
           <w:szCs w:val="22"/>
         </w:rPr>
-        <w:t xml:space="preserve">The exercise of writing meeting norms down is more useful than the norms themselves. It forces a conversation the company was avoiding.</w:t>
+        <w:t xml:space="preserve">The exercise of writing meeting norms down is more useful than the norms themselves. It forces the conversation the company was avoiding. Do it once a quarter, out loud, and half the meetings on your calendar will not survive it.</w:t>
       </w:r>
     </w:p>
     <w:p>
@@ -6335,7 +6335,7 @@
           <w:sz w:val="22"/>
           <w:szCs w:val="22"/>
         </w:rPr>
-        <w:t xml:space="preserve">Whether a workplace conversation happens in a public channel or a private DM is a cultural decision, not a personal one. A DM-heavy culture creates silos, gossip, and the political dynamics that come with them. A public-by-default culture creates transparency and, if unchecked, performance anxiety. The founder who lives in DMs turns leadership into a series of one-to-one relationships that nobody else can see; the team learns that access matters more than information.</w:t>
+        <w:t xml:space="preserve">Whether a workplace conversation happens in a public channel or a private DM is a cultural decision, not a personal one. A DM-heavy culture creates silos, gossip, and the political dynamics that come with them. A public-by-default culture creates transparency and, if unchecked, performance anxiety. The &lt;em&gt;Silicon Valley&lt;/em&gt; archetype of the founder who runs the company through late-night DMs to their favourites is funny on HBO and corrosive in real life. Leadership becomes a series of one-to-one relationships that nobody else can see, and the team learns that access matters more than information.</w:t>
       </w:r>
     </w:p>
     <w:p>
@@ -7047,7 +7047,7 @@
           <w:sz w:val="22"/>
           <w:szCs w:val="22"/>
         </w:rPr>
-        <w:t xml:space="preserve">The DM-heavy companies I have worked at all had the same problem. Leadership found out about things last.</w:t>
+        <w:t xml:space="preserve">The DM-heavy companies I have worked at all had the same problem. Leadership found out about things last. And the moment they did, they discovered a parallel org chart nobody had drawn.</w:t>
       </w:r>
     </w:p>
     <w:p>
@@ -7096,7 +7096,7 @@
           <w:sz w:val="22"/>
           <w:szCs w:val="22"/>
         </w:rPr>
-        <w:t xml:space="preserve">Response time expectations are the least-discussed comms decision and the most consequential for burnout, focus, and trust. An Indeed survey of 500 Indian employees and 500 employers found that 88% of Indian employees are frequently contacted by employers outside work hours, and 79% worry about missed promotions or reputational damage if they tune out. The Right to Disconnect Bill 2025, tabled in the Lok Sabha in December 2025, would make it illegal for employers to demand responses outside official hours. The company that writes its response-time norms down is the one that is ready for that shift, not scrambling under it.</w:t>
+        <w:t xml:space="preserve">Response time expectations are the least-discussed comms decision and the most consequential for burnout, focus, and trust. An Indeed survey of 500 Indian employees and 500 employers found that 88% of Indian employees are frequently contacted by employers outside work hours, and 79% worry about missed promotions or reputational damage if they tune out. Every buzz costs more than the reply: the same &lt;a href="https://www.sciencedirect.com/science/article/abs/pii/S0749597809000399" target="_blank" rel="noopener"&gt;attention-residue effect&lt;/a&gt; means the next task starts with a smudge on the windshield. The &lt;a href="https://prsindia.org/billtrack/the-right-to-disconnect-bill-2018" target="_blank" rel="noopener"&gt;Right to Disconnect Bill 2025&lt;/a&gt;, tabled in the Lok Sabha in December 2025, would make it illegal for employers to demand responses outside official hours. The company that writes its response-time norms down is the one that is ready for that shift, not scrambling under it.</w:t>
       </w:r>
     </w:p>
     <w:p>
@@ -7790,7 +7790,7 @@
           <w:sz w:val="22"/>
           <w:szCs w:val="22"/>
         </w:rPr>
-        <w:t xml:space="preserve">The single highest-leverage ten minutes at your next all-hands is spent writing down what response times you actually expect.</w:t>
+        <w:t xml:space="preserve">The single highest-leverage ten minutes at your next all-hands is spent writing down what response times you actually expect. Anything you leave unsaid, the most anxious person on the team will assume, and then broadcast by example.</w:t>
       </w:r>
     </w:p>
     <w:p>
@@ -7839,7 +7839,7 @@
           <w:sz w:val="22"/>
           <w:szCs w:val="22"/>
         </w:rPr>
-        <w:t xml:space="preserve">The single most-shared internal comms rule on the internet, and one of the easiest to adopt. 'Hi, are you there?' then waiting for a reply before saying what you need wastes both people's time. The sender gets one context switch. The receiver gets two: once to answer the hello, once to answer the actual question. There is a whole website (nohello.net) dedicated to this rule, and every remote-first company eventually adopts a version of it. The small productivity dividend from adopting it is real; the larger mood dividend is bigger.</w:t>
+        <w:t xml:space="preserve">The single most-shared internal comms rule on the internet, and one of the easiest to adopt. 'Hi, are you there?' then waiting for a reply before saying what you need wastes both people's time. The sender gets one context switch. The receiver gets two: once to answer the hello, once to answer the actual question. There is a whole website — &lt;a href="https://nohello.net" target="_blank" rel="noopener"&gt;nohello.net&lt;/a&gt; — dedicated to this rule, and every remote-first company eventually adopts a version of it. The small productivity dividend from adopting it is real. The larger mood dividend is bigger.</w:t>
       </w:r>
     </w:p>
     <w:p>
@@ -8405,7 +8405,7 @@
           <w:sz w:val="22"/>
           <w:szCs w:val="22"/>
         </w:rPr>
-        <w:t xml:space="preserve">How feedback flows through a company is the deepest layer of its internal comms, and the one most Indian startups leave undesigned. A well-run feedback loop compounds over time. A performative one destroys trust faster than the absence of one. Every founder who has run a survey and then gone quiet for three months has taught their team not to answer the next one honestly.</w:t>
+        <w:t xml:space="preserve">How feedback flows through a company is the deepest layer of its internal comms, and the one most Indian startups leave undesigned. A well-run feedback loop compounds over time. A performative one destroys trust faster than the absence of one. Researchers call the temporary bump from being surveyed the &lt;a href="https://en.wikipedia.org/wiki/Hawthorne_effect" target="_blank" rel="noopener"&gt;Hawthorne effect&lt;/a&gt;: people behave differently when they know they are being measured, and the effect fades fast if nothing happens with the data. Every founder who has run a survey and then gone quiet for three months has taught their team not to answer the next one honestly.</w:t>
       </w:r>
     </w:p>
     <w:p>
@@ -9201,7 +9201,7 @@
           <w:sz w:val="22"/>
           <w:szCs w:val="22"/>
         </w:rPr>
-        <w:t xml:space="preserve">The feedback loop is where you learn what your team actually thinks. The version that works is the one you act on.</w:t>
+        <w:t xml:space="preserve">The feedback loop is where you learn what your team actually thinks. The version that works is the one you act on. The version that fails is the survey you send twice, sit on both times, and then wonder why response rates halved.</w:t>
       </w:r>
     </w:p>
     <w:p>

</xml_diff>

<commit_message>
Fix docx, redesign interactives, restructure intros, tune spacing (#4)
Working docx download, single CTA in the take-away pack, redesigned
HeadcountStack slider and WhatGoesWhere quiz, "quietly" removed
except where actually about sound, newsletter editor's note rewritten,
"nobody can defend" replaced, "Every number, traced back" dropped,
every section intro restructured to lead with the reference and follow
with the recommendation, spacing tuned throughout, editorial column
widened, toolkit .docx regenerated.
</commit_message>
<xml_diff>
--- a/public/plum-internal-comms-toolkit.docx
+++ b/public/plum-internal-comms-toolkit.docx
@@ -195,7 +195,7 @@
           <w:sz w:val="22"/>
           <w:szCs w:val="22"/>
         </w:rPr>
-        <w:t xml:space="preserve">The all-hands is the loudest signal a company sends about how it makes decisions and who gets to hear about them. Gallup's 2026 report put Indian employee engagement at 23%, a four-year low, and manager engagement in India fell from 39% to 30% in a single year. When managers pass along less of the strategy sideways, the all-hands has to carry more of it directly. And there is a hard ceiling on how many people can meaningfully talk to each other at once: &lt;a href="https://en.wikipedia.org/wiki/Dunbar%27s_number" target="_blank" rel="noopener"&gt;Dunbar's number&lt;/a&gt; says the number of stable relationships one person can maintain caps out around 150, and the working-conversation subset is much smaller. The founder who treats the all-hands as a status update is missing the room's real question: is this still a place I want to work in a year.</w:t>
+        <w:t xml:space="preserve">There is a hard ceiling on how many people can talk to each other at the same time and still call it a conversation. Robin Dunbar put the number of stable relationships one person can hold at around 150 — &lt;a href="https://en.wikipedia.org/wiki/Dunbar%27s_number" target="_blank" rel="noopener"&gt;Dunbar's number&lt;/a&gt; — and the sub-group that can genuinely debate a topic together is closer to twelve. The all-hands sits directly on top of this limit, which is why it stops being a conversation and starts being a broadcast at exactly the moment the room gets too big. Gallup's 2026 report put Indian employee engagement at 23%, a four-year low, and manager engagement in India fell from 39% to 30% in a single year. When managers pass less strategy sideways, the all-hands has to carry more of it. The founder who treats it as a status update is missing the room's real question: is this still a place I want to work in a year.</w:t>
       </w:r>
     </w:p>
     <w:p>
@@ -371,7 +371,7 @@
           <w:sz w:val="22"/>
           <w:szCs w:val="22"/>
         </w:rPr>
-        <w:t xml:space="preserve">Keeping the weekly cadence past 40 people. The format quietly turns from conversation into broadcast, and nobody notices until people stop showing up.</w:t>
+        <w:t xml:space="preserve">Keeping the weekly cadence past 40 people. Somewhere around 45 the format flips from conversation into broadcast, and nobody notices until people stop showing up.</w:t>
       </w:r>
     </w:p>
     <w:p>
@@ -856,7 +856,7 @@
           <w:sz w:val="22"/>
           <w:szCs w:val="22"/>
         </w:rPr>
-        <w:t xml:space="preserve">The &lt;em&gt;Succession&lt;/em&gt; test: if this were dramatised, would anyone find the plot interesting? If your all-hands is 30 minutes of good news read from a slide, the answer is no, and your team is quietly checking their phones.</w:t>
+        <w:t xml:space="preserve">The &lt;em&gt;Succession&lt;/em&gt; test: if this were dramatised, would anyone find the plot interesting? If your all-hands is 30 minutes of good news read from a slide, the answer is no, and half the room is already scrolling.</w:t>
       </w:r>
     </w:p>
     <w:p>
@@ -905,7 +905,7 @@
           <w:sz w:val="22"/>
           <w:szCs w:val="22"/>
         </w:rPr>
-        <w:t xml:space="preserve">Most Indian startups do not have one, and the ones that do run it out of HR. It reads like HR. A newsletter is the only piece of the stack that becomes a permanent record of what the company was thinking at each phase. Matt Levine's &lt;em&gt;Money Stuff&lt;/em&gt; and Julian Shapiro's writing are forwarded around not because they are important but because they are written like a person. Ten years in, your archive will be the truest history of the company. The founder who sends it in their own voice, in the first year, will be grateful in year three that they did.</w:t>
+        <w:t xml:space="preserve">Matt Levine's &lt;em&gt;Money Stuff&lt;/em&gt; is a finance newsletter people forward around because it is written like a person who happens to know finance, not like a bank that happens to publish a newsletter. Julian Shapiro's essays travel the same way. Most Indian startups do not have an internal newsletter, and the ones that do run it out of HR. It reads like HR. A newsletter is the only piece of the comms stack that becomes a permanent record of what the company was thinking at each phase — ten years in, the archive is the truest history of the company. The founder who writes it in their own voice, in the first year, will be grateful in year three that they did.</w:t>
       </w:r>
     </w:p>
     <w:p>
@@ -1286,7 +1286,7 @@
           <w:sz w:val="22"/>
           <w:szCs w:val="22"/>
         </w:rPr>
-        <w:t xml:space="preserve">A hire we made recently. What they are quietly changing about how we work.</w:t>
+        <w:t xml:space="preserve">A hire we made recently. One thing they have already changed about how we work.</w:t>
       </w:r>
     </w:p>
     <w:p>
@@ -1614,7 +1614,7 @@
           <w:sz w:val="22"/>
           <w:szCs w:val="22"/>
         </w:rPr>
-        <w:t xml:space="preserve">The best newsletter I have read from an Indian company was 350 words long and always came in on a Friday. It got forwarded around like gossip. That is the only KPI that matters.</w:t>
+        <w:t xml:space="preserve">The prompts do the work. If the founder has to think of what to write, the note gets skipped. If a prompt is waiting in the doc on Thursday, the note goes out on Friday.</w:t>
       </w:r>
     </w:p>
     <w:p>
@@ -1663,7 +1663,7 @@
           <w:sz w:val="22"/>
           <w:szCs w:val="22"/>
         </w:rPr>
-        <w:t xml:space="preserve">The async update replaces the standing status meeting. Done well, it saves a full afternoon a week per team and gives leadership a written record of what is happening without pulling anyone into a room. Microsoft's 2025 Work Trend Index, based on Microsoft 365 telemetry across 31 markets including India, found employees are interrupted every two minutes during core work hours. Sophie Leroy's &lt;a href="https://www.sciencedirect.com/science/article/abs/pii/S0749597809000399" target="_blank" rel="noopener"&gt;attention-residue research&lt;/a&gt; shows that every context switch leaves a cognitive smear on what comes next. The async update is the format that fights both. The company that does it well ends up with a searchable history of every team's week. The one that does it badly ends up with a graveyard of unread Notion pages.</w:t>
+        <w:t xml:space="preserve">Sophie Leroy's &lt;a href="https://www.sciencedirect.com/science/article/abs/pii/S0749597809000399" target="_blank" rel="noopener"&gt;attention-residue research&lt;/a&gt; found that when we switch from one task to another, the previous task keeps running in the background and makes us worse at the next one. Every status meeting is a switch tax on the entire team, paid twice: once to arrive, once to leave. Microsoft's 2025 Work Trend Index, based on 365 telemetry across 31 markets including India, found employees are interrupted every two minutes during core work hours — so the residue never really clears. The async update replaces the standing status meeting. Done well, it saves a full afternoon a week per team. The company that does it well ends up with a searchable history of every team's week. The one that does it badly ends up with a graveyard of unread Notion pages.</w:t>
       </w:r>
     </w:p>
     <w:p>
@@ -2351,7 +2351,7 @@
           <w:sz w:val="22"/>
           <w:szCs w:val="22"/>
         </w:rPr>
-        <w:t xml:space="preserve">The Slack setup is the most consequential design decision a company makes about comms, and the one leadership least often owns. It defaults into whatever the first three engineers set up. Most Indian companies actually run on a mix: Slack for tech teams, Google Chat inside Workspace, Teams at the enterprise end, and WhatsApp for everything else. The tool matters less than the discipline. Cal Newport calls the alternative the &lt;a href="https://calnewport.com/a-world-without-email/" target="_blank" rel="noopener"&gt;hyperactive hive mind&lt;/a&gt;, and every unstructured Slack becomes one within eighteen months. The workspace that is designed on purpose in month six is the one that still scales at month sixty. The one that is not, is not.</w:t>
+        <w:t xml:space="preserve">Cal Newport calls it the &lt;a href="https://calnewport.com/a-world-without-email/" target="_blank" rel="noopener"&gt;hyperactive hive mind&lt;/a&gt;: a workflow where nobody knows what anyone else is doing, so everyone stays in the tool refreshing, because that is the only way to find out. Every unstructured Slack becomes one within eighteen months. And the Slack setup is the most consequential design decision a company makes about comms, and the one leadership least often owns — it defaults into whatever the first three engineers set up. Most Indian companies actually run on a mix: Slack for tech teams, Google Chat inside Workspace, Teams at the enterprise end, and WhatsApp for everything else. The tool matters less than the discipline. The workspace that is designed on purpose in month six is the one that still scales at month sixty. The one that is not, is not.</w:t>
       </w:r>
     </w:p>
     <w:p>
@@ -2527,7 +2527,7 @@
           <w:sz w:val="22"/>
           <w:szCs w:val="22"/>
         </w:rPr>
-        <w:t xml:space="preserve">Bolting on new channels without ever archiving old ones. Within 18 months the workspace nobody designed becomes the workspace nobody can defend.</w:t>
+        <w:t xml:space="preserve">Bolting on new channels without ever archiving old ones. Within 18 months the workspace nobody designed becomes the workspace nobody can navigate, and every question is asked twice because nobody remembers where the answer lives.</w:t>
       </w:r>
     </w:p>
     <w:p>
@@ -3166,7 +3166,7 @@
           <w:sz w:val="22"/>
           <w:szCs w:val="22"/>
         </w:rPr>
-        <w:t xml:space="preserve">The wiki is the difference between context that compounds and context that leaves when someone quits. Every founder knows they need one. Most underinvest, because the payoff shows up only after the person who wrote it has left. Engineers call this the &lt;a href="https://en.wikipedia.org/wiki/Bus_factor" target="_blank" rel="noopener"&gt;bus factor&lt;/a&gt;: the smallest number of people who could go under a bus before the project can no longer continue. A living wiki raises your bus factor for free. Startups that treat the wiki as the operating system, not the intranet, spend fewer hours a week answering the same questions and lose less institutional memory when someone moves on.</w:t>
+        <w:t xml:space="preserve">Engineers have a grim, useful metric for how fragile a codebase is: the &lt;a href="https://en.wikipedia.org/wiki/Bus_factor" target="_blank" rel="noopener"&gt;bus factor&lt;/a&gt;. The smallest number of people who could be hit by a bus before the project can no longer continue. Most Indian startups have a bus factor of one on half their operating knowledge, and it lives in a founder's head. A living wiki raises that number for free. Every founder knows they need one. Most underinvest, because the payoff shows up only after the person who wrote it has left. Startups that treat the wiki as the operating system, not the intranet, spend fewer hours a week answering the same questions and lose less institutional memory when someone moves on.</w:t>
       </w:r>
     </w:p>
     <w:p>
@@ -3993,7 +3993,7 @@
           <w:sz w:val="22"/>
           <w:szCs w:val="22"/>
         </w:rPr>
-        <w:t xml:space="preserve">How you announce something reveals what you think announcements are for. Big news dropped in the wrong channel gets missed, misheard, or reframed as gossip before leadership can tell the real story. This is the &lt;a href="https://en.wikipedia.org/wiki/Zeigarnik_effect" target="_blank" rel="noopener"&gt;Zeigarnik effect&lt;/a&gt; working against you: unfinished or half-told stories occupy the mind far longer than closed ones, and your team will fill the gaps you leave open. Matching the weight of the news to the medium is the single highest-leverage change in this guide. The company that gets this right builds trust every time it opens its mouth. The one that gets it wrong pays for it in ways that show up in the exit interview.</w:t>
+        <w:t xml:space="preserve">In the 1920s, a psychologist named Bluma Zeigarnik noticed that waiters could recall the details of unpaid orders far more clearly than paid ones — as soon as a bill was settled, the memory faded. The &lt;a href="https://en.wikipedia.org/wiki/Zeigarnik_effect" target="_blank" rel="noopener"&gt;Zeigarnik effect&lt;/a&gt; is now the name for the fact that unfinished or half-told stories occupy the mind far longer than closed ones. Every announcement you land badly is an open tab in your team's head, and they will fill the gaps you leave open. How you announce something reveals what you think announcements are for. Matching the weight of the news to the medium is the single highest-leverage change in this guide.</w:t>
       </w:r>
     </w:p>
     <w:p>
@@ -4772,7 +4772,7 @@
           <w:sz w:val="22"/>
           <w:szCs w:val="22"/>
         </w:rPr>
-        <w:t xml:space="preserve">WhatsApp is the shadow comms layer at almost every Indian company. It is the default for founders, field teams, factory floors, and anyone who checks personal phones more than laptops. If &lt;em&gt;Panchayat&lt;/em&gt; made one thing obvious, it is that in this country, a WhatsApp group is the operating system for anything that touches real people. It is also the layer with zero governance. When an employee leaves, they walk out with every group chat still on their phone, including whatever was said inside them. The company that treats WhatsApp as invisible pays for it during an audit, a dispute, or a data-privacy question years later.</w:t>
+        <w:t xml:space="preserve">If &lt;em&gt;Panchayat&lt;/em&gt; made one thing obvious, it is that in this country a WhatsApp group is the operating system for anything that touches real people. Panchayat elections, school admissions, PTA meetings, apartment complexes, the sabzi order. And also, almost every Indian company. WhatsApp is the shadow comms layer at the office too — the default for founders, field teams, factory floors, and anyone who checks a personal phone more than a laptop. It is also the layer with zero governance. When an employee leaves, they walk out with every group chat still on their phone, including whatever was said inside them. The company that treats WhatsApp as invisible pays for it during an audit, a dispute, or a data-privacy question years later.</w:t>
       </w:r>
     </w:p>
     <w:p>
@@ -5535,7 +5535,7 @@
           <w:sz w:val="22"/>
           <w:szCs w:val="22"/>
         </w:rPr>
-        <w:t xml:space="preserve">Meeting norms are the invisible rules of how a company runs its time. Microsoft's telemetry found meetings starting after 8 pm are up 16% year over year (Work Trend Index 2025, 31 markets including India). Left alone, meetings obey &lt;a href="https://en.wikipedia.org/wiki/Parkinson%27s_law" target="_blank" rel="noopener"&gt;Parkinson's Law&lt;/a&gt;: work expands to fill the time available for its completion, and a 60-minute slot always finds 60 minutes of business. Most Indian startups have never written meeting norms down. The best ones do, and revisit them every six months. Not writing them down is a decision: it says the loudest people in the room set the rules, and everyone else adapts to that.</w:t>
+        <w:t xml:space="preserve">In 1955, a British naval historian named C. Northcote Parkinson wrote a wry essay for &lt;em&gt;The Economist&lt;/em&gt; that opened with the line: 'Work expands to fill the time available for its completion.' It was meant as satire about civil service bureaucracies. &lt;a href="https://en.wikipedia.org/wiki/Parkinson%27s_law" target="_blank" rel="noopener"&gt;Parkinson's Law&lt;/a&gt; is now the reason your 60-minute meetings always fill 60 minutes, whether or not there is 60 minutes of business to discuss. Meeting norms are the only thing that pushes back on it. Microsoft's telemetry found meetings starting after 8 pm are up 16% year over year (Work Trend Index 2025, 31 markets including India). Most Indian startups have never written meeting norms down. The best ones do, and revisit them every six months. Not writing them down is a decision: it says the loudest people in the room set the rules, and everyone else adapts to that.</w:t>
       </w:r>
     </w:p>
     <w:p>
@@ -5564,7 +5564,7 @@
           <w:sz w:val="22"/>
           <w:szCs w:val="22"/>
         </w:rPr>
-        <w:t xml:space="preserve">A shared document that answers: when is video on by default, when are cameras optional, what counts as a no-meeting block, what needs an agenda, and what does not. Reviewed twice a year. A protected no-meeting window at least once a week. A quarterly audit that retires recurring meetings nobody can defend. A culture where 'this could have been a message' is a safe thing to say.</w:t>
+        <w:t xml:space="preserve">A shared document that answers: when is video on by default, when are cameras optional, what counts as a no-meeting block, what needs an agenda, and what does not. Reviewed twice a year. A protected no-meeting window at least once a week. A quarterly audit that retires recurring meetings nobody has an answer for when asked what they are for. A culture where 'this could have been a message' is a safe thing to say.</w:t>
       </w:r>
     </w:p>
     <w:p>
@@ -6335,7 +6335,7 @@
           <w:sz w:val="22"/>
           <w:szCs w:val="22"/>
         </w:rPr>
-        <w:t xml:space="preserve">Whether a workplace conversation happens in a public channel or a private DM is a cultural decision, not a personal one. A DM-heavy culture creates silos, gossip, and the political dynamics that come with them. A public-by-default culture creates transparency and, if unchecked, performance anxiety. The &lt;em&gt;Silicon Valley&lt;/em&gt; archetype of the founder who runs the company through late-night DMs to their favourites is funny on HBO and corrosive in real life. Leadership becomes a series of one-to-one relationships that nobody else can see, and the team learns that access matters more than information.</w:t>
+        <w:t xml:space="preserve">The best joke in &lt;em&gt;Silicon Valley&lt;/em&gt; is that Gavin Belson runs Hooli through late-night one-to-one texts to his favourites, and everyone below him spends the day trying to guess what got promised in which chat. It is funny on HBO because it is what actually happens in DM-heavy companies. Whether a workplace conversation lives in a public channel or a private DM is a cultural decision, not a personal one. A DM-heavy culture creates silos, gossip, and the politics that come with them. A public-by-default culture creates transparency and, if unchecked, performance anxiety. Leadership in a DM-heavy company becomes a series of one-to-one relationships nobody else can see, and the team learns that access matters more than information.</w:t>
       </w:r>
     </w:p>
     <w:p>
@@ -7096,7 +7096,7 @@
           <w:sz w:val="22"/>
           <w:szCs w:val="22"/>
         </w:rPr>
-        <w:t xml:space="preserve">Response time expectations are the least-discussed comms decision and the most consequential for burnout, focus, and trust. An Indeed survey of 500 Indian employees and 500 employers found that 88% of Indian employees are frequently contacted by employers outside work hours, and 79% worry about missed promotions or reputational damage if they tune out. Every buzz costs more than the reply: the same &lt;a href="https://www.sciencedirect.com/science/article/abs/pii/S0749597809000399" target="_blank" rel="noopener"&gt;attention-residue effect&lt;/a&gt; means the next task starts with a smudge on the windshield. The &lt;a href="https://prsindia.org/billtrack/the-right-to-disconnect-bill-2018" target="_blank" rel="noopener"&gt;Right to Disconnect Bill 2025&lt;/a&gt;, tabled in the Lok Sabha in December 2025, would make it illegal for employers to demand responses outside official hours. The company that writes its response-time norms down is the one that is ready for that shift, not scrambling under it.</w:t>
+        <w:t xml:space="preserve">88% of Indian employees are frequently contacted by employers outside work hours; 79% worry that tuning out will cost them a promotion (Indeed India, 2024). And every buzz costs more than the reply. Sophie Leroy's &lt;a href="https://www.sciencedirect.com/science/article/abs/pii/S0749597809000399" target="_blank" rel="noopener"&gt;attention-residue research&lt;/a&gt; found that the next task starts with a smudge on the windshield from the last one, so the four-word Slack ping you fired at 10:47 pm cost the receiver 20 minutes of focus after the reply was sent. Response-time expectations are the least-discussed comms decision and the most consequential for burnout, focus, and trust. The &lt;a href="https://prsindia.org/billtrack/the-right-to-disconnect-bill-2018" target="_blank" rel="noopener"&gt;Right to Disconnect Bill 2025&lt;/a&gt;, tabled in the Lok Sabha in December 2025, would make it illegal for employers to demand responses outside official hours. The company that writes its response-time norms down is the one ready for that shift, not scrambling under it.</w:t>
       </w:r>
     </w:p>
     <w:p>
@@ -7839,7 +7839,7 @@
           <w:sz w:val="22"/>
           <w:szCs w:val="22"/>
         </w:rPr>
-        <w:t xml:space="preserve">The single most-shared internal comms rule on the internet, and one of the easiest to adopt. 'Hi, are you there?' then waiting for a reply before saying what you need wastes both people's time. The sender gets one context switch. The receiver gets two: once to answer the hello, once to answer the actual question. There is a whole website — &lt;a href="https://nohello.net" target="_blank" rel="noopener"&gt;nohello.net&lt;/a&gt; — dedicated to this rule, and every remote-first company eventually adopts a version of it. The small productivity dividend from adopting it is real. The larger mood dividend is bigger.</w:t>
+        <w:t xml:space="preserve">Somebody, at some point, made a website called &lt;a href="https://nohello.net" target="_blank" rel="noopener"&gt;nohello.net&lt;/a&gt; so they never had to explain the rule twice again. The rule: do not send 'hi' and stop. 'Hi, are you there?' then waiting for the reply before saying what you actually want wastes both people's time. The sender gets one context switch. The receiver gets two — once to answer the hello, once to answer the real question — plus the anxiety of not knowing what is coming until you turn up. Every remote-first company eventually adopts a version of the rule. The small productivity dividend is real. The larger mood dividend is bigger.</w:t>
       </w:r>
     </w:p>
     <w:p>
@@ -8405,7 +8405,7 @@
           <w:sz w:val="22"/>
           <w:szCs w:val="22"/>
         </w:rPr>
-        <w:t xml:space="preserve">How feedback flows through a company is the deepest layer of its internal comms, and the one most Indian startups leave undesigned. A well-run feedback loop compounds over time. A performative one destroys trust faster than the absence of one. Researchers call the temporary bump from being surveyed the &lt;a href="https://en.wikipedia.org/wiki/Hawthorne_effect" target="_blank" rel="noopener"&gt;Hawthorne effect&lt;/a&gt;: people behave differently when they know they are being measured, and the effect fades fast if nothing happens with the data. Every founder who has run a survey and then gone quiet for three months has taught their team not to answer the next one honestly.</w:t>
+        <w:t xml:space="preserve">In the late 1920s, researchers at the Hawthorne Works factory in Illinois found that workers' productivity went up whenever someone was studying them, and dropped as soon as the researchers left. The &lt;a href="https://en.wikipedia.org/wiki/Hawthorne_effect" target="_blank" rel="noopener"&gt;Hawthorne effect&lt;/a&gt; is now shorthand for the temporary bump you get whenever people know they are being measured — and the crash that follows if nothing happens with the data. Every founder who has run a survey and then gone silent for three months has taught their team not to answer the next one honestly. How feedback flows through a company is the deepest layer of its internal comms, and the one most Indian startups leave undesigned. A well-run feedback loop compounds over time. A performative one destroys trust faster than the absence of one.</w:t>
       </w:r>
     </w:p>
     <w:p>

</xml_diff>

<commit_message>
Drop "the messy middle" tag; use "first real managers" instead
The 15-to-50 band label was a Scott Belsky catchphrase that
smuggled itself in and clashed with the tone of the other two
labels ("5 to 15 people", "Series A onwards"). The defining feature
of that headcount range is that founders finally hire people whose
full job is managing others, and the org chart starts to matter.
"First real managers" captures that.

Bulk-replaced across all twelve sections' band data and the
headcount-stack "at 15 people" copy.

Toolkit .docx regenerated in the same build.

Co-Authored-By: Claude Opus 4.7 <noreply@anthropic.com>
Claude-Session: https://claude.ai/code/session_01EHPQFCziUbJ2Ri7VXv9Cny
</commit_message>
<xml_diff>
--- a/public/plum-internal-comms-toolkit.docx
+++ b/public/plum-internal-comms-toolkit.docx
@@ -299,7 +299,7 @@
           <w:sz w:val="20"/>
           <w:szCs w:val="20"/>
         </w:rPr>
-        <w:t xml:space="preserve">The messy middle</w:t>
+        <w:t xml:space="preserve">First real managers</w:t>
       </w:r>
       <w:r>
         <w:rPr>
@@ -1009,7 +1009,7 @@
           <w:sz w:val="20"/>
           <w:szCs w:val="20"/>
         </w:rPr>
-        <w:t xml:space="preserve">The messy middle</w:t>
+        <w:t xml:space="preserve">First real managers</w:t>
       </w:r>
       <w:r>
         <w:rPr>
@@ -1767,7 +1767,7 @@
           <w:sz w:val="20"/>
           <w:szCs w:val="20"/>
         </w:rPr>
-        <w:t xml:space="preserve">The messy middle</w:t>
+        <w:t xml:space="preserve">First real managers</w:t>
       </w:r>
       <w:r>
         <w:rPr>
@@ -2455,7 +2455,7 @@
           <w:sz w:val="20"/>
           <w:szCs w:val="20"/>
         </w:rPr>
-        <w:t xml:space="preserve">The messy middle</w:t>
+        <w:t xml:space="preserve">First real managers</w:t>
       </w:r>
       <w:r>
         <w:rPr>
@@ -3270,7 +3270,7 @@
           <w:sz w:val="20"/>
           <w:szCs w:val="20"/>
         </w:rPr>
-        <w:t xml:space="preserve">The messy middle</w:t>
+        <w:t xml:space="preserve">First real managers</w:t>
       </w:r>
       <w:r>
         <w:rPr>
@@ -4097,7 +4097,7 @@
           <w:sz w:val="20"/>
           <w:szCs w:val="20"/>
         </w:rPr>
-        <w:t xml:space="preserve">The messy middle</w:t>
+        <w:t xml:space="preserve">First real managers</w:t>
       </w:r>
       <w:r>
         <w:rPr>
@@ -4876,7 +4876,7 @@
           <w:sz w:val="20"/>
           <w:szCs w:val="20"/>
         </w:rPr>
-        <w:t xml:space="preserve">The messy middle</w:t>
+        <w:t xml:space="preserve">First real managers</w:t>
       </w:r>
       <w:r>
         <w:rPr>
@@ -5639,7 +5639,7 @@
           <w:sz w:val="20"/>
           <w:szCs w:val="20"/>
         </w:rPr>
-        <w:t xml:space="preserve">The messy middle</w:t>
+        <w:t xml:space="preserve">First real managers</w:t>
       </w:r>
       <w:r>
         <w:rPr>
@@ -6439,7 +6439,7 @@
           <w:sz w:val="20"/>
           <w:szCs w:val="20"/>
         </w:rPr>
-        <w:t xml:space="preserve">The messy middle</w:t>
+        <w:t xml:space="preserve">First real managers</w:t>
       </w:r>
       <w:r>
         <w:rPr>
@@ -7200,7 +7200,7 @@
           <w:sz w:val="20"/>
           <w:szCs w:val="20"/>
         </w:rPr>
-        <w:t xml:space="preserve">The messy middle</w:t>
+        <w:t xml:space="preserve">First real managers</w:t>
       </w:r>
       <w:r>
         <w:rPr>
@@ -7943,7 +7943,7 @@
           <w:sz w:val="20"/>
           <w:szCs w:val="20"/>
         </w:rPr>
-        <w:t xml:space="preserve">The messy middle</w:t>
+        <w:t xml:space="preserve">First real managers</w:t>
       </w:r>
       <w:r>
         <w:rPr>
@@ -8509,7 +8509,7 @@
           <w:sz w:val="20"/>
           <w:szCs w:val="20"/>
         </w:rPr>
-        <w:t xml:space="preserve">The messy middle</w:t>
+        <w:t xml:space="preserve">First real managers</w:t>
       </w:r>
       <w:r>
         <w:rPr>

</xml_diff>

<commit_message>
Simplify 15-50 eyebrow to "15 to 50"
Dropped the "First real managers" tag per feedback. The eyebrow now
just says the range. Note that this duplicates the h4 headline
("15 to 50") for that middle band; happy to remove the eyebrow
entirely if the duplication feels off.

Bulk-replaced across all twelve sections' band data.

Toolkit .docx regenerated in the same build.

Co-Authored-By: Claude Opus 4.7 <noreply@anthropic.com>
Claude-Session: https://claude.ai/code/session_01EHPQFCziUbJ2Ri7VXv9Cny
</commit_message>
<xml_diff>
--- a/public/plum-internal-comms-toolkit.docx
+++ b/public/plum-internal-comms-toolkit.docx
@@ -299,7 +299,7 @@
           <w:sz w:val="20"/>
           <w:szCs w:val="20"/>
         </w:rPr>
-        <w:t xml:space="preserve">First real managers</w:t>
+        <w:t xml:space="preserve">15 to 50</w:t>
       </w:r>
       <w:r>
         <w:rPr>
@@ -1009,7 +1009,7 @@
           <w:sz w:val="20"/>
           <w:szCs w:val="20"/>
         </w:rPr>
-        <w:t xml:space="preserve">First real managers</w:t>
+        <w:t xml:space="preserve">15 to 50</w:t>
       </w:r>
       <w:r>
         <w:rPr>
@@ -1767,7 +1767,7 @@
           <w:sz w:val="20"/>
           <w:szCs w:val="20"/>
         </w:rPr>
-        <w:t xml:space="preserve">First real managers</w:t>
+        <w:t xml:space="preserve">15 to 50</w:t>
       </w:r>
       <w:r>
         <w:rPr>
@@ -2455,7 +2455,7 @@
           <w:sz w:val="20"/>
           <w:szCs w:val="20"/>
         </w:rPr>
-        <w:t xml:space="preserve">First real managers</w:t>
+        <w:t xml:space="preserve">15 to 50</w:t>
       </w:r>
       <w:r>
         <w:rPr>
@@ -3270,7 +3270,7 @@
           <w:sz w:val="20"/>
           <w:szCs w:val="20"/>
         </w:rPr>
-        <w:t xml:space="preserve">First real managers</w:t>
+        <w:t xml:space="preserve">15 to 50</w:t>
       </w:r>
       <w:r>
         <w:rPr>
@@ -4097,7 +4097,7 @@
           <w:sz w:val="20"/>
           <w:szCs w:val="20"/>
         </w:rPr>
-        <w:t xml:space="preserve">First real managers</w:t>
+        <w:t xml:space="preserve">15 to 50</w:t>
       </w:r>
       <w:r>
         <w:rPr>
@@ -4876,7 +4876,7 @@
           <w:sz w:val="20"/>
           <w:szCs w:val="20"/>
         </w:rPr>
-        <w:t xml:space="preserve">First real managers</w:t>
+        <w:t xml:space="preserve">15 to 50</w:t>
       </w:r>
       <w:r>
         <w:rPr>
@@ -5639,7 +5639,7 @@
           <w:sz w:val="20"/>
           <w:szCs w:val="20"/>
         </w:rPr>
-        <w:t xml:space="preserve">First real managers</w:t>
+        <w:t xml:space="preserve">15 to 50</w:t>
       </w:r>
       <w:r>
         <w:rPr>
@@ -6439,7 +6439,7 @@
           <w:sz w:val="20"/>
           <w:szCs w:val="20"/>
         </w:rPr>
-        <w:t xml:space="preserve">First real managers</w:t>
+        <w:t xml:space="preserve">15 to 50</w:t>
       </w:r>
       <w:r>
         <w:rPr>
@@ -7200,7 +7200,7 @@
           <w:sz w:val="20"/>
           <w:szCs w:val="20"/>
         </w:rPr>
-        <w:t xml:space="preserve">First real managers</w:t>
+        <w:t xml:space="preserve">15 to 50</w:t>
       </w:r>
       <w:r>
         <w:rPr>
@@ -7943,7 +7943,7 @@
           <w:sz w:val="20"/>
           <w:szCs w:val="20"/>
         </w:rPr>
-        <w:t xml:space="preserve">First real managers</w:t>
+        <w:t xml:space="preserve">15 to 50</w:t>
       </w:r>
       <w:r>
         <w:rPr>
@@ -8509,7 +8509,7 @@
           <w:sz w:val="20"/>
           <w:szCs w:val="20"/>
         </w:rPr>
-        <w:t xml:space="preserve">First real managers</w:t>
+        <w:t xml:space="preserve">15 to 50</w:t>
       </w:r>
       <w:r>
         <w:rPr>

</xml_diff>

<commit_message>
Fix slider tick math; drop messy middle for a plain range (#10)
Slider ticks now sit exactly under the thumb at every stop (tick
positions computed as calc(13px + (100% - 26px) * pct) to match
the thumb's actual travel range). "The messy middle" replaced with
"15 to 50" across all band data. Two lingering "nobody defends"
phrases rewritten. Toolkit .docx regenerated.
</commit_message>
<xml_diff>
--- a/public/plum-internal-comms-toolkit.docx
+++ b/public/plum-internal-comms-toolkit.docx
@@ -299,7 +299,7 @@
           <w:sz w:val="20"/>
           <w:szCs w:val="20"/>
         </w:rPr>
-        <w:t xml:space="preserve">The messy middle</w:t>
+        <w:t xml:space="preserve">15 to 50</w:t>
       </w:r>
       <w:r>
         <w:rPr>
@@ -1009,7 +1009,7 @@
           <w:sz w:val="20"/>
           <w:szCs w:val="20"/>
         </w:rPr>
-        <w:t xml:space="preserve">The messy middle</w:t>
+        <w:t xml:space="preserve">15 to 50</w:t>
       </w:r>
       <w:r>
         <w:rPr>
@@ -1767,7 +1767,7 @@
           <w:sz w:val="20"/>
           <w:szCs w:val="20"/>
         </w:rPr>
-        <w:t xml:space="preserve">The messy middle</w:t>
+        <w:t xml:space="preserve">15 to 50</w:t>
       </w:r>
       <w:r>
         <w:rPr>
@@ -2455,7 +2455,7 @@
           <w:sz w:val="20"/>
           <w:szCs w:val="20"/>
         </w:rPr>
-        <w:t xml:space="preserve">The messy middle</w:t>
+        <w:t xml:space="preserve">15 to 50</w:t>
       </w:r>
       <w:r>
         <w:rPr>
@@ -3270,7 +3270,7 @@
           <w:sz w:val="20"/>
           <w:szCs w:val="20"/>
         </w:rPr>
-        <w:t xml:space="preserve">The messy middle</w:t>
+        <w:t xml:space="preserve">15 to 50</w:t>
       </w:r>
       <w:r>
         <w:rPr>
@@ -4097,7 +4097,7 @@
           <w:sz w:val="20"/>
           <w:szCs w:val="20"/>
         </w:rPr>
-        <w:t xml:space="preserve">The messy middle</w:t>
+        <w:t xml:space="preserve">15 to 50</w:t>
       </w:r>
       <w:r>
         <w:rPr>
@@ -4876,7 +4876,7 @@
           <w:sz w:val="20"/>
           <w:szCs w:val="20"/>
         </w:rPr>
-        <w:t xml:space="preserve">The messy middle</w:t>
+        <w:t xml:space="preserve">15 to 50</w:t>
       </w:r>
       <w:r>
         <w:rPr>
@@ -5639,7 +5639,7 @@
           <w:sz w:val="20"/>
           <w:szCs w:val="20"/>
         </w:rPr>
-        <w:t xml:space="preserve">The messy middle</w:t>
+        <w:t xml:space="preserve">15 to 50</w:t>
       </w:r>
       <w:r>
         <w:rPr>
@@ -5682,7 +5682,7 @@
           <w:szCs w:val="22"/>
         </w:rPr>
         <w:br/>
-        <w:t xml:space="preserve"> A full meeting charter in the wiki. One no-meeting day a week. A quarterly meeting audit that deletes recurring meetings nobody defends.</w:t>
+        <w:t xml:space="preserve"> A full meeting charter in the wiki. One no-meeting day a week. A quarterly meeting audit that deletes recurring meetings nobody has an answer for.</w:t>
       </w:r>
     </w:p>
     <w:p>
@@ -6439,7 +6439,7 @@
           <w:sz w:val="20"/>
           <w:szCs w:val="20"/>
         </w:rPr>
-        <w:t xml:space="preserve">The messy middle</w:t>
+        <w:t xml:space="preserve">15 to 50</w:t>
       </w:r>
       <w:r>
         <w:rPr>
@@ -7200,7 +7200,7 @@
           <w:sz w:val="20"/>
           <w:szCs w:val="20"/>
         </w:rPr>
-        <w:t xml:space="preserve">The messy middle</w:t>
+        <w:t xml:space="preserve">15 to 50</w:t>
       </w:r>
       <w:r>
         <w:rPr>
@@ -7943,7 +7943,7 @@
           <w:sz w:val="20"/>
           <w:szCs w:val="20"/>
         </w:rPr>
-        <w:t xml:space="preserve">The messy middle</w:t>
+        <w:t xml:space="preserve">15 to 50</w:t>
       </w:r>
       <w:r>
         <w:rPr>
@@ -8509,7 +8509,7 @@
           <w:sz w:val="20"/>
           <w:szCs w:val="20"/>
         </w:rPr>
-        <w:t xml:space="preserve">The messy middle</w:t>
+        <w:t xml:space="preserve">15 to 50</w:t>
       </w:r>
       <w:r>
         <w:rPr>

</xml_diff>

<commit_message>
Copy pass; promote How other companies do it in TOC (#12)
Rewrote intro and every section's "why it matters" to strip
AI-writing patterns. Kept concrete anchors (Dunbar, Sophie Leroy,
etc). Nine editor's notes rewritten. Moved "How other companies do
it" out of the bottom extras into its own IV — In the wild TOC
block. Toolkit .docx regenerated.
</commit_message>
<xml_diff>
--- a/public/plum-internal-comms-toolkit.docx
+++ b/public/plum-internal-comms-toolkit.docx
@@ -90,7 +90,7 @@
           <w:sz w:val="22"/>
           <w:szCs w:val="22"/>
         </w:rPr>
-        <w:t xml:space="preserve">Every Indian startup has an internal comms system. Almost none of them chose it. The channels, the meeting cadence, the response-time norms were inherited from whoever set up Slack first, and they hardened into culture. It is the equivalent of moving into a house and never rearranging the furniture. You live around the shape of what someone else decided.</w:t>
+        <w:t xml:space="preserve">At most Indian startups, internal comms wasn't designed. It was inherited from whoever set up Slack first. The channels, the meetings, the response-time expectations — nobody sat down and decided any of that. It just settled, and then people started calling it culture.</w:t>
       </w:r>
     </w:p>
     <w:p>
@@ -103,7 +103,7 @@
           <w:sz w:val="22"/>
           <w:szCs w:val="22"/>
         </w:rPr>
-        <w:t xml:space="preserve">The bill for this shows up late. Employees miss things they should have seen. Decisions get made in DMs and evaporate before the record forms. The founder becomes the human router, forwarding messages between teams that could just be talking. By the time it hurts, it has been that way for a year, and unlearning it feels harder than it should.</w:t>
+        <w:t xml:space="preserve">The costs show up later. People miss things they should have seen. Decisions get made in DMs and disappear. Founders spend the day forwarding messages between teams that could be talking to each other. By the time you notice, it has been like this for a year, and changing it feels harder than starting from scratch.</w:t>
       </w:r>
     </w:p>
     <w:p>
@@ -116,7 +116,7 @@
           <w:sz w:val="22"/>
           <w:szCs w:val="22"/>
         </w:rPr>
-        <w:t xml:space="preserve">This guide is a chance to design it on purpose. It is staged by team size, sourced where sources help, and full of things you can copy this week. Pick your headcount, open the sections you have been avoiding, and steal the templates at the bottom. The tone is a friend who has done this before, not a consultant selling a framework. If any of it makes you say &lt;em&gt;we already do the opposite of this&lt;/em&gt;, that is the point.</w:t>
+        <w:t xml:space="preserve">This guide is a chance to fix that. It's arranged by team size, cites its sources, and gives you things to copy. Pick your headcount, open the section you've been avoiding, and take the templates at the bottom.</w:t>
       </w:r>
     </w:p>
     <w:p>
@@ -195,7 +195,7 @@
           <w:sz w:val="22"/>
           <w:szCs w:val="22"/>
         </w:rPr>
-        <w:t xml:space="preserve">There is a hard ceiling on how many people can talk to each other at the same time and still call it a conversation. Robin Dunbar put the number of stable relationships one person can hold at around 150 — &lt;a href="https://en.wikipedia.org/wiki/Dunbar%27s_number" target="_blank" rel="noopener"&gt;Dunbar's number&lt;/a&gt; — and the sub-group that can genuinely debate a topic together is closer to twelve. The all-hands sits directly on top of this limit, which is why it stops being a conversation and starts being a broadcast at exactly the moment the room gets too big. Gallup's 2026 report put Indian employee engagement at 23%, a four-year low, and manager engagement in India fell from 39% to 30% in a single year. When managers pass less strategy sideways, the all-hands has to carry more of it. The founder who treats it as a status update is missing the room's real question: is this still a place I want to work in a year.</w:t>
+        <w:t xml:space="preserve">Robin Dunbar's research on group size — the one behind &lt;a href="https://en.wikipedia.org/wiki/Dunbar%27s_number" target="_blank" rel="noopener"&gt;Dunbar's number&lt;/a&gt; — puts a ceiling on how many people can hold a stable working relationship at around 150, and the sub-group that can debate a topic together is closer to twelve. Every all-hands runs into this. Below a certain size, it's a conversation. Above it, it becomes a broadcast, whether you meant it to or not. Gallup's 2026 numbers give you the other half of the picture: Indian employee engagement is at 23%, a four-year low, and manager engagement fell from 39% to 30% in a year. Managers are passing less down. So the all-hands has to do more of that work directly.</w:t>
       </w:r>
     </w:p>
     <w:p>
@@ -856,7 +856,7 @@
           <w:sz w:val="22"/>
           <w:szCs w:val="22"/>
         </w:rPr>
-        <w:t xml:space="preserve">The &lt;em&gt;Succession&lt;/em&gt; test: if this were dramatised, would anyone find the plot interesting? If your all-hands is 30 minutes of good news read from a slide, the answer is no, and half the room is already scrolling.</w:t>
+        <w:t xml:space="preserve">If your all-hands is thirty minutes of good news read off a slide, people will show up for the first two and then stop turning cameras on.</w:t>
       </w:r>
     </w:p>
     <w:p>
@@ -905,7 +905,7 @@
           <w:sz w:val="22"/>
           <w:szCs w:val="22"/>
         </w:rPr>
-        <w:t xml:space="preserve">Matt Levine's &lt;em&gt;Money Stuff&lt;/em&gt; is a finance newsletter people forward around because it is written like a person who happens to know finance, not like a bank that happens to publish a newsletter. Julian Shapiro's essays travel the same way. Most Indian startups do not have an internal newsletter, and the ones that do run it out of HR. It reads like HR. A newsletter is the only piece of the comms stack that becomes a permanent record of what the company was thinking at each phase — ten years in, the archive is the truest history of the company. The founder who writes it in their own voice, in the first year, will be grateful in year three that they did.</w:t>
+        <w:t xml:space="preserve">Matt Levine's &lt;em&gt;Money Stuff&lt;/em&gt; works because it's written by a person who happens to know finance, not by a bank that happens to publish a newsletter. Julian Shapiro's essays are the same. Most Indian startups don't have an internal newsletter, and the ones that do usually run it out of HR, and it reads like HR. That's a missed thing. The newsletter is the only part of the comms stack that becomes a written record of what the company was thinking at each phase. In three years, someone new joins and reads it end to end to understand how you got here. That's worth writing for.</w:t>
       </w:r>
     </w:p>
     <w:p>
@@ -1614,7 +1614,7 @@
           <w:sz w:val="22"/>
           <w:szCs w:val="22"/>
         </w:rPr>
-        <w:t xml:space="preserve">The prompts do the work. If the founder has to think of what to write, the note gets skipped. If a prompt is waiting in the doc on Thursday, the note goes out on Friday.</w:t>
+        <w:t xml:space="preserve">The prompts do the work. If the founder has to think of what to write, the note gets skipped. If a prompt is waiting in the doc on Thursday, the note goes out on Friday. Set up the doc once.</w:t>
       </w:r>
     </w:p>
     <w:p>
@@ -1663,7 +1663,7 @@
           <w:sz w:val="22"/>
           <w:szCs w:val="22"/>
         </w:rPr>
-        <w:t xml:space="preserve">Sophie Leroy's &lt;a href="https://www.sciencedirect.com/science/article/abs/pii/S0749597809000399" target="_blank" rel="noopener"&gt;attention-residue research&lt;/a&gt; found that when we switch from one task to another, the previous task keeps running in the background and makes us worse at the next one. Every status meeting is a switch tax on the entire team, paid twice: once to arrive, once to leave. Microsoft's 2025 Work Trend Index, based on 365 telemetry across 31 markets including India, found employees are interrupted every two minutes during core work hours — so the residue never really clears. The async update replaces the standing status meeting. Done well, it saves a full afternoon a week per team. The company that does it well ends up with a searchable history of every team's week. The one that does it badly ends up with a graveyard of unread Notion pages.</w:t>
+        <w:t xml:space="preserve">Sophie Leroy's &lt;a href="https://www.sciencedirect.com/science/article/abs/pii/S0749597809000399" target="_blank" rel="noopener"&gt;attention-residue research&lt;/a&gt; found that when you switch from one task to another, the previous task keeps running in the background and makes the next one worse. Every status meeting is a switch tax on the whole team, paid twice — once to show up, once to get back to work. Microsoft's 2025 Work Trend Index, on 365 telemetry across 31 markets including India, found employees are interrupted every two minutes during core work hours, so nobody's residue ever fully clears. The async update replaces the standing status meeting. Written weekly, in the same shape, at the same time, it can save every team an afternoon.</w:t>
       </w:r>
     </w:p>
     <w:p>
@@ -2264,7 +2264,7 @@
           <w:sz w:val="22"/>
           <w:szCs w:val="22"/>
         </w:rPr>
-        <w:t xml:space="preserve">The rule I would enforce is that if two teams write updates and nobody reads them, the format is broken. Fix the format, not the writers.</w:t>
+        <w:t xml:space="preserve">If two teams write updates and nobody reads them, the format is the problem, not the writers. Rewrite the template, then try again.</w:t>
       </w:r>
     </w:p>
     <w:p>
@@ -2351,7 +2351,7 @@
           <w:sz w:val="22"/>
           <w:szCs w:val="22"/>
         </w:rPr>
-        <w:t xml:space="preserve">Cal Newport calls it the &lt;a href="https://calnewport.com/a-world-without-email/" target="_blank" rel="noopener"&gt;hyperactive hive mind&lt;/a&gt;: a workflow where nobody knows what anyone else is doing, so everyone stays in the tool refreshing, because that is the only way to find out. Every unstructured Slack becomes one within eighteen months. And the Slack setup is the most consequential design decision a company makes about comms, and the one leadership least often owns — it defaults into whatever the first three engineers set up. Most Indian companies actually run on a mix: Slack for tech teams, Google Chat inside Workspace, Teams at the enterprise end, and WhatsApp for everything else. The tool matters less than the discipline. The workspace that is designed on purpose in month six is the one that still scales at month sixty. The one that is not, is not.</w:t>
+        <w:t xml:space="preserve">Cal Newport calls it the &lt;a href="https://calnewport.com/a-world-without-email/" target="_blank" rel="noopener"&gt;hyperactive hive mind&lt;/a&gt;: a workflow where nobody knows what anyone else is doing, so everyone stays in the tool refreshing because that's the only way to find out. Every unstructured Slack becomes one, given eighteen months. The Slack setup itself is a design decision most leadership teams have never made on purpose — it defaults to whatever the first three engineers set up. Most Indian companies actually run on a mix: Slack for tech, Google Chat inside Workspace, Teams at the enterprise end, and WhatsApp for everything else. The tool matters less than the taxonomy. What you decide about channels in month six is what you will still be arguing about in month sixty.</w:t>
       </w:r>
     </w:p>
     <w:p>
@@ -3117,7 +3117,7 @@
           <w:sz w:val="22"/>
           <w:szCs w:val="22"/>
         </w:rPr>
-        <w:t xml:space="preserve">The best Slack setups I have seen delete more channels than they add each quarter. That is the whole discipline. Everything else is decor.</w:t>
+        <w:t xml:space="preserve">The best Slack setups I've seen delete more channels than they add each quarter. That's most of the work.</w:t>
       </w:r>
     </w:p>
     <w:p>
@@ -3166,7 +3166,7 @@
           <w:sz w:val="22"/>
           <w:szCs w:val="22"/>
         </w:rPr>
-        <w:t xml:space="preserve">Engineers have a grim, useful metric for how fragile a codebase is: the &lt;a href="https://en.wikipedia.org/wiki/Bus_factor" target="_blank" rel="noopener"&gt;bus factor&lt;/a&gt;. The smallest number of people who could be hit by a bus before the project can no longer continue. Most Indian startups have a bus factor of one on half their operating knowledge, and it lives in a founder's head. A living wiki raises that number for free. Every founder knows they need one. Most underinvest, because the payoff shows up only after the person who wrote it has left. Startups that treat the wiki as the operating system, not the intranet, spend fewer hours a week answering the same questions and lose less institutional memory when someone moves on.</w:t>
+        <w:t xml:space="preserve">Engineers have a name for how fragile a codebase is: the &lt;a href="https://en.wikipedia.org/wiki/Bus_factor" target="_blank" rel="noopener"&gt;bus factor&lt;/a&gt;. The smallest number of people who could be hit by a bus before the project can't continue. Most Indian startups have a bus factor of one on a lot of their operating knowledge, and it lives in a founder's head. A wiki that's actually used raises that number without you having to hire for it. The reason most founders underinvest here is that the payoff arrives too late to feel like a good use of time today — you notice how much easier things are only after the person who wrote the page has left.</w:t>
       </w:r>
     </w:p>
     <w:p>
@@ -3944,7 +3944,7 @@
           <w:sz w:val="22"/>
           <w:szCs w:val="22"/>
         </w:rPr>
-        <w:t xml:space="preserve">A well-kept Google Docs setup beats a neglected Notion. The tool matters less than whether someone owns it.</w:t>
+        <w:t xml:space="preserve">A well-kept Google Docs setup beats a neglected Notion. Whoever owns it is what matters.</w:t>
       </w:r>
     </w:p>
     <w:p>
@@ -3993,7 +3993,7 @@
           <w:sz w:val="22"/>
           <w:szCs w:val="22"/>
         </w:rPr>
-        <w:t xml:space="preserve">In the 1920s, a psychologist named Bluma Zeigarnik noticed that waiters could recall the details of unpaid orders far more clearly than paid ones — as soon as a bill was settled, the memory faded. The &lt;a href="https://en.wikipedia.org/wiki/Zeigarnik_effect" target="_blank" rel="noopener"&gt;Zeigarnik effect&lt;/a&gt; is now the name for the fact that unfinished or half-told stories occupy the mind far longer than closed ones. Every announcement you land badly is an open tab in your team's head, and they will fill the gaps you leave open. How you announce something reveals what you think announcements are for. Matching the weight of the news to the medium is the single highest-leverage change in this guide.</w:t>
+        <w:t xml:space="preserve">In the 1920s, a psychologist named Bluma Zeigarnik noticed that waiters could recall the details of unpaid orders more clearly than paid ones. Once the bill was settled, the memory faded. The &lt;a href="https://en.wikipedia.org/wiki/Zeigarnik_effect" target="_blank" rel="noopener"&gt;Zeigarnik effect&lt;/a&gt; is the name for what she observed: unfinished or half-told stories sit in the mind much longer than closed ones. Every announcement you land badly is an open tab in someone's head, and they will fill in what you didn't say. Matching the weight of the news to the medium you use to say it is probably the highest-leverage change in this guide.</w:t>
       </w:r>
     </w:p>
     <w:p>
@@ -4723,7 +4723,7 @@
           <w:sz w:val="22"/>
           <w:szCs w:val="22"/>
         </w:rPr>
-        <w:t xml:space="preserve">If you find yourself explaining the same news three times to three different people, it needed a bigger channel than the one you picked. And the third person's version will already be different from what you actually said.</w:t>
+        <w:t xml:space="preserve">If you're explaining the same news three times to three different people, it needed a bigger channel than the one you picked. And by the third telling, the version being repeated back to you won't be the one you shared.</w:t>
       </w:r>
     </w:p>
     <w:p>
@@ -4772,7 +4772,7 @@
           <w:sz w:val="22"/>
           <w:szCs w:val="22"/>
         </w:rPr>
-        <w:t xml:space="preserve">If &lt;em&gt;Panchayat&lt;/em&gt; made one thing obvious, it is that in this country a WhatsApp group is the operating system for anything that touches real people. Panchayat elections, school admissions, PTA meetings, apartment complexes, the sabzi order. And also, almost every Indian company. WhatsApp is the shadow comms layer at the office too — the default for founders, field teams, factory floors, and anyone who checks a personal phone more than a laptop. It is also the layer with zero governance. When an employee leaves, they walk out with every group chat still on their phone, including whatever was said inside them. The company that treats WhatsApp as invisible pays for it during an audit, a dispute, or a data-privacy question years later.</w:t>
+        <w:t xml:space="preserve">In India, WhatsApp is the operating system for anything involving real people. School admissions, apartment complexes, the sabzi order, political campaigns, and offices too. It's the default at almost every Indian company: for founders, field teams, factory floors, and anyone who spends more time on a personal phone than a laptop. It's also the layer with no governance. When someone leaves, they walk out with every group chat still on their phone, including whatever was said inside it. Companies that treat WhatsApp as invisible tend to notice it during an audit, a dispute, or a data-privacy question — always later than would have been useful.</w:t>
       </w:r>
     </w:p>
     <w:p>
@@ -5448,7 +5448,7 @@
           <w:sz w:val="22"/>
           <w:szCs w:val="22"/>
         </w:rPr>
-        <w:t xml:space="preserve">If a message about someone's salary is on a founder's personal WhatsApp, the company has a governance problem, not a WhatsApp problem.</w:t>
+        <w:t xml:space="preserve">If a message about someone's salary is on a founder's personal WhatsApp, that's a governance problem, not a WhatsApp problem.</w:t>
       </w:r>
     </w:p>
     <w:p>
@@ -5535,7 +5535,7 @@
           <w:sz w:val="22"/>
           <w:szCs w:val="22"/>
         </w:rPr>
-        <w:t xml:space="preserve">In 1955, a British naval historian named C. Northcote Parkinson wrote a wry essay for &lt;em&gt;The Economist&lt;/em&gt; that opened with the line: 'Work expands to fill the time available for its completion.' It was meant as satire about civil service bureaucracies. &lt;a href="https://en.wikipedia.org/wiki/Parkinson%27s_law" target="_blank" rel="noopener"&gt;Parkinson's Law&lt;/a&gt; is now the reason your 60-minute meetings always fill 60 minutes, whether or not there is 60 minutes of business to discuss. Meeting norms are the only thing that pushes back on it. Microsoft's telemetry found meetings starting after 8 pm are up 16% year over year (Work Trend Index 2025, 31 markets including India). Most Indian startups have never written meeting norms down. The best ones do, and revisit them every six months. Not writing them down is a decision: it says the loudest people in the room set the rules, and everyone else adapts to that.</w:t>
+        <w:t xml:space="preserve">In 1955, a British naval historian named C. Northcote Parkinson wrote a satirical essay for &lt;em&gt;The Economist&lt;/em&gt; that opened with a single line: 'Work expands to fill the time available for its completion.' He meant it as a joke about civil-service bureaucracies. &lt;a href="https://en.wikipedia.org/wiki/Parkinson%27s_law" target="_blank" rel="noopener"&gt;Parkinson's Law&lt;/a&gt; is now the reason a 60-minute meeting fills 60 minutes whether or not there's 60 minutes of business to talk about. The only thing that pushes back is written meeting norms. Microsoft's Work Trend Index 2025 (31 markets, including India) found meetings starting after 8 pm are up 16% year over year. Most Indian startups have never written any norms down. When you don't, the loudest person in the room sets them, and everyone else works around that.</w:t>
       </w:r>
     </w:p>
     <w:p>
@@ -6286,7 +6286,7 @@
           <w:sz w:val="22"/>
           <w:szCs w:val="22"/>
         </w:rPr>
-        <w:t xml:space="preserve">The exercise of writing meeting norms down is more useful than the norms themselves. It forces the conversation the company was avoiding. Do it once a quarter, out loud, and half the meetings on your calendar will not survive it.</w:t>
+        <w:t xml:space="preserve">Writing the norms down forces the conversation the company has been avoiding. Do it once a quarter, and half the meetings on your calendar won't survive it.</w:t>
       </w:r>
     </w:p>
     <w:p>
@@ -6335,7 +6335,7 @@
           <w:sz w:val="22"/>
           <w:szCs w:val="22"/>
         </w:rPr>
-        <w:t xml:space="preserve">Logan Roy runs Waystar Royco through one-on-one favouritism. The whole engine of &lt;em&gt;Succession&lt;/em&gt; is his kids and lieutenants trying to work out what he promised to whom, in which quiet phone call — and adjusting their day accordingly. On HBO it makes four seasons of prestige television. Inside a real company, it makes an org chart nobody else can read. Whether a workplace conversation lives in a public channel or a private DM is a cultural decision, not a personal one. A DM-heavy culture creates silos, gossip, and the politics that come with them. A public-by-default culture creates transparency and, if unchecked, performance anxiety. Leadership in a DM-heavy company becomes a series of one-to-one relationships nobody else can see, and the team learns that access matters more than information.</w:t>
+        <w:t xml:space="preserve">Logan Roy runs Waystar Royco through one-on-one favouritism. The whole engine of &lt;em&gt;Succession&lt;/em&gt; is his kids and lieutenants trying to figure out what he promised to whom, in which phone call, and adjusting their day accordingly. On HBO that makes four seasons of television. Inside a real company, it makes an org chart nobody else can read. Whether a workplace conversation lives in a channel or a DM is a cultural decision, not a personal one. A DM-heavy culture builds silos, gossip, and the politics that come with them. A channel-heavy one gets transparency, and — unchecked — a lot of performance anxiety. Leadership in a DM-heavy company ends up as a series of relationships nobody else can see. The team notices, and starts to compete for access instead of for the work.</w:t>
       </w:r>
     </w:p>
     <w:p>
@@ -7047,7 +7047,7 @@
           <w:sz w:val="22"/>
           <w:szCs w:val="22"/>
         </w:rPr>
-        <w:t xml:space="preserve">The DM-heavy companies I have worked at all had the same problem. Leadership found out about things last. And the moment they did, they discovered a parallel org chart nobody had drawn.</w:t>
+        <w:t xml:space="preserve">In the DM-heavy companies I've worked at, leadership always found out about things last. And when they did, there was already a parallel org chart nobody had drawn.</w:t>
       </w:r>
     </w:p>
     <w:p>
@@ -7096,7 +7096,7 @@
           <w:sz w:val="22"/>
           <w:szCs w:val="22"/>
         </w:rPr>
-        <w:t xml:space="preserve">88% of Indian employees are frequently contacted by employers outside work hours; 79% worry that tuning out will cost them a promotion (Indeed India, 2024). And every buzz costs more than the reply. Sophie Leroy's &lt;a href="https://www.sciencedirect.com/science/article/abs/pii/S0749597809000399" target="_blank" rel="noopener"&gt;attention-residue research&lt;/a&gt; found that the next task starts with a smudge on the windshield from the last one, so the four-word Slack ping you fired at 10:47 pm cost the receiver 20 minutes of focus after the reply was sent. Response-time expectations are the least-discussed comms decision and the most consequential for burnout, focus, and trust. The &lt;a href="https://prsindia.org/billtrack/the-right-to-disconnect-bill-2018" target="_blank" rel="noopener"&gt;Right to Disconnect Bill 2025&lt;/a&gt;, tabled in the Lok Sabha in December 2025, would make it illegal for employers to demand responses outside official hours. The company that writes its response-time norms down is the one ready for that shift, not scrambling under it.</w:t>
+        <w:t xml:space="preserve">88% of Indian employees are frequently contacted by employers outside work hours; 79% say they worry that tuning out will cost them a promotion (Indeed India, 2024). And every ping costs more than the reply. Sophie Leroy's &lt;a href="https://www.sciencedirect.com/science/article/abs/pii/S0749597809000399" target="_blank" rel="noopener"&gt;attention-residue research&lt;/a&gt; shows the task after an interruption starts with residue from the one before. The four-word Slack message you sent at 10:47 pm cost the person on the other side twenty more minutes of focus after they typed the reply. Response-time expectations are the comms decision that gets discussed least and matters most for burnout and trust. The &lt;a href="https://prsindia.org/billtrack/the-right-to-disconnect-bill-2018" target="_blank" rel="noopener"&gt;Right to Disconnect Bill 2025&lt;/a&gt;, tabled in the Lok Sabha last December, would make it illegal for employers to demand replies outside official hours. Writing your own norms down now means you're not scrambling if the bill passes.</w:t>
       </w:r>
     </w:p>
     <w:p>
@@ -7790,7 +7790,7 @@
           <w:sz w:val="22"/>
           <w:szCs w:val="22"/>
         </w:rPr>
-        <w:t xml:space="preserve">The single highest-leverage ten minutes at your next all-hands is spent writing down what response times you actually expect. Anything you leave unsaid, the most anxious person on the team will assume, and then broadcast by example.</w:t>
+        <w:t xml:space="preserve">Take ten minutes at your next all-hands to write down what response times you actually expect. Whatever you leave unsaid, the most anxious person on the team assumes the worst version of, and then teaches it to everyone else by example.</w:t>
       </w:r>
     </w:p>
     <w:p>
@@ -7839,7 +7839,7 @@
           <w:sz w:val="22"/>
           <w:szCs w:val="22"/>
         </w:rPr>
-        <w:t xml:space="preserve">Somebody, at some point, made a website called &lt;a href="https://nohello.net" target="_blank" rel="noopener"&gt;nohello.net&lt;/a&gt; so they never had to explain the rule twice again. The rule: do not send 'hi' and stop. 'Hi, are you there?' then waiting for the reply before saying what you actually want wastes both people's time. The sender gets one context switch. The receiver gets two — once to answer the hello, once to answer the real question — plus the anxiety of not knowing what is coming until you turn up. Every remote-first company eventually adopts a version of the rule. The small productivity dividend is real. The larger mood dividend is bigger.</w:t>
+        <w:t xml:space="preserve">Somebody, at some point, made &lt;a href="https://nohello.net" target="_blank" rel="noopener"&gt;nohello.net&lt;/a&gt; so they'd never have to explain the rule twice again. The rule is: don't send 'hi' and stop. 'Hi, are you there?' followed by waiting for the reply before saying what you actually want costs both people time. The sender pays one context switch. The receiver pays two — one to answer the hello, another for the real question — plus the low-grade anxiety of not knowing what's coming. Every remote-first company gets to some version of this rule. The productivity dividend is real, and the mood dividend is bigger.</w:t>
       </w:r>
     </w:p>
     <w:p>
@@ -8356,7 +8356,7 @@
           <w:sz w:val="22"/>
           <w:szCs w:val="22"/>
         </w:rPr>
-        <w:t xml:space="preserve">The teams that adopt this rule get a small productivity dividend and a large mood dividend. Nobody misses the 'hello, are you there?' ping.</w:t>
+        <w:t xml:space="preserve">You will not miss the 'hi, are you there?' ping. Nobody does.</w:t>
       </w:r>
     </w:p>
     <w:p>
@@ -8405,7 +8405,7 @@
           <w:sz w:val="22"/>
           <w:szCs w:val="22"/>
         </w:rPr>
-        <w:t xml:space="preserve">In the late 1920s, researchers at the Hawthorne Works factory in Illinois found that workers' productivity went up whenever someone was studying them, and dropped as soon as the researchers left. The &lt;a href="https://en.wikipedia.org/wiki/Hawthorne_effect" target="_blank" rel="noopener"&gt;Hawthorne effect&lt;/a&gt; is now shorthand for the temporary bump you get whenever people know they are being measured — and the crash that follows if nothing happens with the data. Every founder who has run a survey and then gone silent for three months has taught their team not to answer the next one honestly. How feedback flows through a company is the deepest layer of its internal comms, and the one most Indian startups leave undesigned. A well-run feedback loop compounds over time. A performative one destroys trust faster than the absence of one.</w:t>
+        <w:t xml:space="preserve">In the late 1920s, researchers at the Hawthorne Works factory in Illinois found that workers' productivity rose whenever someone was studying them, and dropped as soon as the researchers left. The &lt;a href="https://en.wikipedia.org/wiki/Hawthorne_effect" target="_blank" rel="noopener"&gt;Hawthorne effect&lt;/a&gt; is now shorthand for the bump you get from being watched, and the crash that follows if nothing changes as a result. Every founder who has run an engagement survey and then gone quiet for three months has taught the team not to answer the next one honestly. How feedback moves through a company is the deepest layer of its internal comms. It's also the one Indian startups tend to leave undesigned. A well-run feedback loop compounds. A performative one costs you more trust than not having one at all.</w:t>
       </w:r>
     </w:p>
     <w:p>
@@ -9201,7 +9201,7 @@
           <w:sz w:val="22"/>
           <w:szCs w:val="22"/>
         </w:rPr>
-        <w:t xml:space="preserve">The feedback loop is where you learn what your team actually thinks. The version that works is the one you act on. The version that fails is the survey you send twice, sit on both times, and then wonder why response rates halved.</w:t>
+        <w:t xml:space="preserve">You learn what your team actually thinks through this loop. The version that works is the one you act on. The version that fails is the survey you send twice, sit on both times, and then wonder why the response rate halved.</w:t>
       </w:r>
     </w:p>
     <w:p>

</xml_diff>